<commit_message>
Add recycling pilot specifics
Co-authored-by: Copilot App <223556219+Copilot@users.noreply.github.com>

Copilot-Session: f52b38de-497b-4d34-b9ec-b6709605e0eb
</commit_message>
<xml_diff>
--- a/episode-07/demo-assets/Recycling-Dashboard-Notes.docx
+++ b/episode-07/demo-assets/Recycling-Dashboard-Notes.docx
@@ -74,7 +74,33 @@
         <w:spacing w:after="40"/>
       </w:pPr>
       <w:r>
-        <w:t xml:space="preserve">recommended three changes</w:t>
+        <w:t xml:space="preserve">recommended standardized picture-based recycling labels</w:t>
+      </w:r>
+    </w:p>
+    <w:p>
+      <w:pPr>
+        <w:pStyle w:val="ListParagraph"/>
+        <w:numPr>
+          <w:ilvl w:val="0"/>
+          <w:numId w:val="2"/>
+        </w:numPr>
+        <w:spacing w:after="40"/>
+      </w:pPr>
+      <w:r>
+        <w:t xml:space="preserve">recommended pairing recycling and landfill bins at the same stations</w:t>
+      </w:r>
+    </w:p>
+    <w:p>
+      <w:pPr>
+        <w:pStyle w:val="ListParagraph"/>
+        <w:numPr>
+          <w:ilvl w:val="0"/>
+          <w:numId w:val="2"/>
+        </w:numPr>
+        <w:spacing w:after="40"/>
+      </w:pPr>
+      <w:r>
+        <w:t xml:space="preserve">recommended testing revised bin placement in selected high-traffic areas</w:t>
       </w:r>
     </w:p>
     <w:p>
@@ -249,7 +275,33 @@
         <w:spacing w:after="40"/>
       </w:pPr>
       <w:r>
-        <w:t xml:space="preserve">I recommended three changes</w:t>
+        <w:t xml:space="preserve">standardized picture-based recycling labels</w:t>
+      </w:r>
+    </w:p>
+    <w:p>
+      <w:pPr>
+        <w:pStyle w:val="ListParagraph"/>
+        <w:numPr>
+          <w:ilvl w:val="0"/>
+          <w:numId w:val="2"/>
+        </w:numPr>
+        <w:spacing w:after="40"/>
+      </w:pPr>
+      <w:r>
+        <w:t xml:space="preserve">pair recycling and landfill bins at the same stations</w:t>
+      </w:r>
+    </w:p>
+    <w:p>
+      <w:pPr>
+        <w:pStyle w:val="ListParagraph"/>
+        <w:numPr>
+          <w:ilvl w:val="0"/>
+          <w:numId w:val="2"/>
+        </w:numPr>
+        <w:spacing w:after="40"/>
+      </w:pPr>
+      <w:r>
+        <w:t xml:space="preserve">test revised bin placement in selected high-traffic areas</w:t>
       </w:r>
     </w:p>
     <w:p>
@@ -327,7 +379,7 @@
         <w:spacing w:after="40"/>
       </w:pPr>
       <w:r>
-        <w:t xml:space="preserve">not in these notes: the exact recommendations or why the office selected them</w:t>
+        <w:t xml:space="preserve">not in these notes: why the office selected the recommendations</w:t>
       </w:r>
     </w:p>
     <w:p>

</xml_diff>